<commit_message>
Galmudug report: add four Galkacyo photos to Annex A
Co-Authored-By: Claude Sonnet 5.5 <noreply@anthropic.com>
Claude-Session: https://claude.ai/code/session_01B6RPWkBpLKoctTdaNtAabD
</commit_message>
<xml_diff>
--- a/state_reports/Rasmi_Event_Management_Report_HoA_DRIVE_Galmudug.docx
+++ b/state_reports/Rasmi_Event_Management_Report_HoA_DRIVE_Galmudug.docx
@@ -3949,6 +3949,284 @@
         <w:spacing w:after="40"/>
       </w:pPr>
     </w:p>
+    <w:p>
+      <w:pPr>
+        <w:pStyle w:val="Heading2"/>
+      </w:pPr>
+      <w:r>
+        <w:t>Photos: Galkacyo</w:t>
+      </w:r>
+    </w:p>
+    <w:tbl>
+      <w:tblPr>
+        <w:tblW w:type="auto" w:w="0"/>
+        <w:jc w:val="center"/>
+        <w:tblLayout w:type="fixed"/>
+        <w:tblLook w:firstColumn="1" w:firstRow="1" w:lastColumn="0" w:lastRow="0" w:noHBand="0" w:noVBand="1" w:val="04A0"/>
+      </w:tblPr>
+      <w:tblGrid>
+        <w:gridCol w:w="4706"/>
+        <w:gridCol w:w="4706"/>
+      </w:tblGrid>
+      <w:tr>
+        <w:trPr>
+          <w:cantSplit/>
+        </w:trPr>
+        <w:tc>
+          <w:tcPr>
+            <w:tcW w:type="dxa" w:w="4535"/>
+          </w:tcPr>
+          <w:p>
+            <w:pPr>
+              <w:keepNext/>
+              <w:spacing w:after="40"/>
+              <w:jc w:val="center"/>
+            </w:pPr>
+            <w:r>
+              <w:drawing>
+                <wp:inline xmlns:a="http://schemas.openxmlformats.org/drawingml/2006/main" xmlns:pic="http://schemas.openxmlformats.org/drawingml/2006/picture">
+                  <wp:extent cx="2808000" cy="1322306"/>
+                  <wp:docPr id="4" name="Picture 4"/>
+                  <wp:cNvGraphicFramePr>
+                    <a:graphicFrameLocks noChangeAspect="1"/>
+                  </wp:cNvGraphicFramePr>
+                  <a:graphic>
+                    <a:graphicData uri="http://schemas.openxmlformats.org/drawingml/2006/picture">
+                      <pic:pic>
+                        <pic:nvPicPr>
+                          <pic:cNvPr id="0" name="photo1.jpg"/>
+                          <pic:cNvPicPr/>
+                        </pic:nvPicPr>
+                        <pic:blipFill>
+                          <a:blip r:embed="rId19"/>
+                          <a:stretch>
+                            <a:fillRect/>
+                          </a:stretch>
+                        </pic:blipFill>
+                        <pic:spPr>
+                          <a:xfrm>
+                            <a:off x="0" y="0"/>
+                            <a:ext cx="2808000" cy="1322306"/>
+                          </a:xfrm>
+                          <a:prstGeom prst="rect"/>
+                        </pic:spPr>
+                      </pic:pic>
+                    </a:graphicData>
+                  </a:graphic>
+                </wp:inline>
+              </w:drawing>
+            </w:r>
+          </w:p>
+          <w:p>
+            <w:pPr>
+              <w:spacing w:after="160"/>
+              <w:jc w:val="center"/>
+            </w:pPr>
+            <w:r>
+              <w:rPr>
+                <w:rFonts w:ascii="Arial" w:hAnsi="Arial"/>
+                <w:b w:val="0"/>
+                <w:i/>
+                <w:color w:val="555F4A"/>
+                <w:sz w:val="17"/>
+              </w:rPr>
+              <w:t>Stainless steel 20-litre milk cans on solar freezers, with boxed equipment stacked behind.</w:t>
+            </w:r>
+          </w:p>
+        </w:tc>
+        <w:tc>
+          <w:tcPr>
+            <w:tcW w:type="dxa" w:w="4535"/>
+          </w:tcPr>
+          <w:p>
+            <w:pPr>
+              <w:keepNext/>
+              <w:spacing w:after="40"/>
+              <w:jc w:val="center"/>
+            </w:pPr>
+            <w:r>
+              <w:drawing>
+                <wp:inline xmlns:a="http://schemas.openxmlformats.org/drawingml/2006/main" xmlns:pic="http://schemas.openxmlformats.org/drawingml/2006/picture">
+                  <wp:extent cx="2808000" cy="1262364"/>
+                  <wp:docPr id="5" name="Picture 5"/>
+                  <wp:cNvGraphicFramePr>
+                    <a:graphicFrameLocks noChangeAspect="1"/>
+                  </wp:cNvGraphicFramePr>
+                  <a:graphic>
+                    <a:graphicData uri="http://schemas.openxmlformats.org/drawingml/2006/picture">
+                      <pic:pic>
+                        <pic:nvPicPr>
+                          <pic:cNvPr id="0" name="photo2.jpg"/>
+                          <pic:cNvPicPr/>
+                        </pic:nvPicPr>
+                        <pic:blipFill>
+                          <a:blip r:embed="rId20"/>
+                          <a:stretch>
+                            <a:fillRect/>
+                          </a:stretch>
+                        </pic:blipFill>
+                        <pic:spPr>
+                          <a:xfrm>
+                            <a:off x="0" y="0"/>
+                            <a:ext cx="2808000" cy="1262364"/>
+                          </a:xfrm>
+                          <a:prstGeom prst="rect"/>
+                        </pic:spPr>
+                      </pic:pic>
+                    </a:graphicData>
+                  </a:graphic>
+                </wp:inline>
+              </w:drawing>
+            </w:r>
+          </w:p>
+          <w:p>
+            <w:pPr>
+              <w:spacing w:after="160"/>
+              <w:jc w:val="center"/>
+            </w:pPr>
+            <w:r>
+              <w:rPr>
+                <w:rFonts w:ascii="Arial" w:hAnsi="Arial"/>
+                <w:b w:val="0"/>
+                <w:i/>
+                <w:color w:val="555F4A"/>
+                <w:sz w:val="17"/>
+              </w:rPr>
+              <w:t>Solar freezers topped with milk cans, with boxes and solar panels laid out behind.</w:t>
+            </w:r>
+          </w:p>
+        </w:tc>
+      </w:tr>
+      <w:tr>
+        <w:trPr>
+          <w:cantSplit/>
+        </w:trPr>
+        <w:tc>
+          <w:tcPr>
+            <w:tcW w:type="dxa" w:w="4535"/>
+          </w:tcPr>
+          <w:p>
+            <w:pPr>
+              <w:keepNext/>
+              <w:spacing w:after="40"/>
+              <w:jc w:val="center"/>
+            </w:pPr>
+            <w:r>
+              <w:drawing>
+                <wp:inline xmlns:a="http://schemas.openxmlformats.org/drawingml/2006/main" xmlns:pic="http://schemas.openxmlformats.org/drawingml/2006/picture">
+                  <wp:extent cx="2808000" cy="1353619"/>
+                  <wp:docPr id="6" name="Picture 6"/>
+                  <wp:cNvGraphicFramePr>
+                    <a:graphicFrameLocks noChangeAspect="1"/>
+                  </wp:cNvGraphicFramePr>
+                  <a:graphic>
+                    <a:graphicData uri="http://schemas.openxmlformats.org/drawingml/2006/picture">
+                      <pic:pic>
+                        <pic:nvPicPr>
+                          <pic:cNvPr id="0" name="photo3.jpg"/>
+                          <pic:cNvPicPr/>
+                        </pic:nvPicPr>
+                        <pic:blipFill>
+                          <a:blip r:embed="rId21"/>
+                          <a:stretch>
+                            <a:fillRect/>
+                          </a:stretch>
+                        </pic:blipFill>
+                        <pic:spPr>
+                          <a:xfrm>
+                            <a:off x="0" y="0"/>
+                            <a:ext cx="2808000" cy="1353619"/>
+                          </a:xfrm>
+                          <a:prstGeom prst="rect"/>
+                        </pic:spPr>
+                      </pic:pic>
+                    </a:graphicData>
+                  </a:graphic>
+                </wp:inline>
+              </w:drawing>
+            </w:r>
+          </w:p>
+          <w:p>
+            <w:pPr>
+              <w:spacing w:after="160"/>
+              <w:jc w:val="center"/>
+            </w:pPr>
+            <w:r>
+              <w:rPr>
+                <w:rFonts w:ascii="Arial" w:hAnsi="Arial"/>
+                <w:b w:val="0"/>
+                <w:i/>
+                <w:color w:val="555F4A"/>
+                <w:sz w:val="17"/>
+              </w:rPr>
+              <w:t>Solar panels laid out in a row along a wall, with solar freezers and boxed milk cans beyond.</w:t>
+            </w:r>
+          </w:p>
+        </w:tc>
+        <w:tc>
+          <w:tcPr>
+            <w:tcW w:type="dxa" w:w="4535"/>
+          </w:tcPr>
+          <w:p>
+            <w:pPr>
+              <w:keepNext/>
+              <w:spacing w:after="40"/>
+              <w:jc w:val="center"/>
+            </w:pPr>
+            <w:r>
+              <w:drawing>
+                <wp:inline xmlns:a="http://schemas.openxmlformats.org/drawingml/2006/main" xmlns:pic="http://schemas.openxmlformats.org/drawingml/2006/picture">
+                  <wp:extent cx="2808000" cy="1333610"/>
+                  <wp:docPr id="7" name="Picture 7"/>
+                  <wp:cNvGraphicFramePr>
+                    <a:graphicFrameLocks noChangeAspect="1"/>
+                  </wp:cNvGraphicFramePr>
+                  <a:graphic>
+                    <a:graphicData uri="http://schemas.openxmlformats.org/drawingml/2006/picture">
+                      <pic:pic>
+                        <pic:nvPicPr>
+                          <pic:cNvPr id="0" name="photo4.jpg"/>
+                          <pic:cNvPicPr/>
+                        </pic:nvPicPr>
+                        <pic:blipFill>
+                          <a:blip r:embed="rId22"/>
+                          <a:stretch>
+                            <a:fillRect/>
+                          </a:stretch>
+                        </pic:blipFill>
+                        <pic:spPr>
+                          <a:xfrm>
+                            <a:off x="0" y="0"/>
+                            <a:ext cx="2808000" cy="1333610"/>
+                          </a:xfrm>
+                          <a:prstGeom prst="rect"/>
+                        </pic:spPr>
+                      </pic:pic>
+                    </a:graphicData>
+                  </a:graphic>
+                </wp:inline>
+              </w:drawing>
+            </w:r>
+          </w:p>
+          <w:p>
+            <w:pPr>
+              <w:spacing w:after="160"/>
+              <w:jc w:val="center"/>
+            </w:pPr>
+            <w:r>
+              <w:rPr>
+                <w:rFonts w:ascii="Arial" w:hAnsi="Arial"/>
+                <w:b w:val="0"/>
+                <w:i/>
+                <w:color w:val="555F4A"/>
+                <w:sz w:val="17"/>
+              </w:rPr>
+              <w:t>Rows of solar freezers (labelled DC 12V/24V Solar Freezer) with cables and control units on the ground.</w:t>
+            </w:r>
+          </w:p>
+        </w:tc>
+      </w:tr>
+    </w:tbl>
     <w:sectPr>
       <w:headerReference w:type="default" r:id="rId9"/>
       <w:footerReference w:type="default" r:id="rId10"/>

</xml_diff>

<commit_message>
Galmudug report: add Dhusamareeb photo to Annex A
Co-Authored-By: Claude Sonnet 5.5 <noreply@anthropic.com>
Claude-Session: https://claude.ai/code/session_01B6RPWkBpLKoctTdaNtAabD
</commit_message>
<xml_diff>
--- a/state_reports/Rasmi_Event_Management_Report_HoA_DRIVE_Galmudug.docx
+++ b/state_reports/Rasmi_Event_Management_Report_HoA_DRIVE_Galmudug.docx
@@ -4227,6 +4227,92 @@
         </w:tc>
       </w:tr>
     </w:tbl>
+    <w:p>
+      <w:pPr>
+        <w:pStyle w:val="Heading2"/>
+      </w:pPr>
+      <w:r>
+        <w:t>Photos: Dhusamareeb</w:t>
+      </w:r>
+    </w:p>
+    <w:tbl>
+      <w:tblPr>
+        <w:tblW w:type="auto" w:w="0"/>
+        <w:jc w:val="center"/>
+        <w:tblLayout w:type="fixed"/>
+        <w:tblLook w:firstColumn="1" w:firstRow="1" w:lastColumn="0" w:lastRow="0" w:noHBand="0" w:noVBand="1" w:val="04A0"/>
+      </w:tblPr>
+      <w:tblGrid>
+        <w:gridCol w:w="9412"/>
+      </w:tblGrid>
+      <w:tr>
+        <w:trPr>
+          <w:cantSplit/>
+        </w:trPr>
+        <w:tc>
+          <w:tcPr>
+            <w:tcW w:type="dxa" w:w="7370"/>
+          </w:tcPr>
+          <w:p>
+            <w:pPr>
+              <w:keepNext/>
+              <w:spacing w:after="40"/>
+              <w:jc w:val="center"/>
+            </w:pPr>
+            <w:r>
+              <w:drawing>
+                <wp:inline xmlns:a="http://schemas.openxmlformats.org/drawingml/2006/main" xmlns:pic="http://schemas.openxmlformats.org/drawingml/2006/picture">
+                  <wp:extent cx="4320000" cy="1260172"/>
+                  <wp:docPr id="8" name="Picture 8"/>
+                  <wp:cNvGraphicFramePr>
+                    <a:graphicFrameLocks noChangeAspect="1"/>
+                  </wp:cNvGraphicFramePr>
+                  <a:graphic>
+                    <a:graphicData uri="http://schemas.openxmlformats.org/drawingml/2006/picture">
+                      <pic:pic>
+                        <pic:nvPicPr>
+                          <pic:cNvPr id="0" name="dhusamareeb1.jpg"/>
+                          <pic:cNvPicPr/>
+                        </pic:nvPicPr>
+                        <pic:blipFill>
+                          <a:blip r:embed="rId23"/>
+                          <a:stretch>
+                            <a:fillRect/>
+                          </a:stretch>
+                        </pic:blipFill>
+                        <pic:spPr>
+                          <a:xfrm>
+                            <a:off x="0" y="0"/>
+                            <a:ext cx="4320000" cy="1260172"/>
+                          </a:xfrm>
+                          <a:prstGeom prst="rect"/>
+                        </pic:spPr>
+                      </pic:pic>
+                    </a:graphicData>
+                  </a:graphic>
+                </wp:inline>
+              </w:drawing>
+            </w:r>
+          </w:p>
+          <w:p>
+            <w:pPr>
+              <w:spacing w:after="160"/>
+              <w:jc w:val="center"/>
+            </w:pPr>
+            <w:r>
+              <w:rPr>
+                <w:rFonts w:ascii="Arial" w:hAnsi="Arial"/>
+                <w:b w:val="0"/>
+                <w:i/>
+                <w:color w:val="555F4A"/>
+                <w:sz w:val="17"/>
+              </w:rPr>
+              <w:t>Boxed units set out in rows on open ground.</w:t>
+            </w:r>
+          </w:p>
+        </w:tc>
+      </w:tr>
+    </w:tbl>
     <w:sectPr>
       <w:headerReference w:type="default" r:id="rId9"/>
       <w:footerReference w:type="default" r:id="rId10"/>

</xml_diff>